<commit_message>
Refresh PAI forum talks 06-10 notes with richer metrics
Regenerate Word docs from the refined structured notes for CARIAD,
Xiaomi, Physical AI, TurboX, and the embodied-AI roundtable.

Co-authored-by: Annie <Annie-Summer@users.noreply.github.com>
</commit_message>
<xml_diff>
--- a/yunqi-2026-pai-forum/docs/06-企业工程化AI提效-知识、流程和智能系统-蒋忠波.docx
+++ b/yunqi-2026-pai-forum/docs/06-企业工程化AI提效-知识、流程和智能系统-蒋忠波.docx
@@ -25,7 +25,7 @@
           <w:b/>
           <w:sz w:val="22"/>
         </w:rPr>
-        <w:t>演讲：蒋忠波 · 大众CARIAD中国 · 云平台和AI效能研发</w:t>
+        <w:t>演讲：蒋忠波 · 大众CARIAD中国 · 云平台和AI效能研发总监</w:t>
       </w:r>
     </w:p>
     <w:p>
@@ -64,7 +64,7 @@
           <w:b w:val="0"/>
           <w:sz w:val="22"/>
         </w:rPr>
-        <w:t>蒋忠波分享大众CARIAD如何把「个人用好大模型」升级为「企业工程化AI提效」。核心矛盾是LLM的概率性本质与汽车软件工程对规模、复杂度、协作与稳定产出的刚性要求。演讲给出CEA AI效能平台三层架构，并以整车故障归因系统证明：用知识骨架引导符号推理，才能把Agent从演示变成可审计、可版本管理的工程资产。</w:t>
+        <w:t>蒋忠波分享大众CARIAD如何把「个人用好大模型」升级为「企业工程化AI提效」。核心矛盾是LLM的概率性本质与汽车软件工程对规模、复杂度、协作与稳定产出的刚性要求。演讲给出CEA AI效能平台三层架构（模型服务 / HARNESS / 业务应用），并以整车故障归因系统证明：用知识骨架引导符号推理，才能把Agent从演示变成可审计、可版本管理的工程资产。</w:t>
       </w:r>
     </w:p>
     <w:p>
@@ -277,7 +277,7 @@
           <w:b w:val="0"/>
           <w:sz w:val="22"/>
         </w:rPr>
-        <w:t>第一层模型服务层基于阿里云PAI：推理网关（统一API/智能路由）、开源模型部署（GLM/Qwen/DeepSeek/MiniMax）、后训练（数据集管理与开源微调）、GPU资源管理。</w:t>
+        <w:t>第一层模型服务层基于阿里云PAI：推理网关（统一API/智能路由）、开源模型部署（GLM/Qwen/DeepSeek/MiniMax）、后训练（数据集管理与开源微调）、GPU资源管理（NV GPU/IPU等）。</w:t>
       </w:r>
     </w:p>
     <w:p>
@@ -801,7 +801,7 @@
           <w:b w:val="0"/>
           <w:sz w:val="22"/>
         </w:rPr>
-        <w:t>技术环：CEA Skill Hub优化、代码图谱定位、领域本体支持定界、整车知识支持定界定位。</w:t>
+        <w:t>技术环：CEA Skill Hub优化、代码图谱定位问题、构建领域本体支持泛化、整车知识支持定界定位。</w:t>
       </w:r>
     </w:p>
     <w:p>
@@ -921,7 +921,7 @@
           <w:b w:val="0"/>
           <w:sz w:val="22"/>
         </w:rPr>
-        <w:t>企业AI平台应按「业务扩张环 + 技术稳定环」双轨运营；Skill Hub、代码图谱、领域本体应作为平台级能力沉淀，而不是项目一次性脚本。</w:t>
+        <w:t>企业AI平台应按「业务扩张环 + 技术稳定环」双轨运营；Skill Hub、代码图谱、领域本体应作为平台级能力持续迭代，而不是项目一次性交付。</w:t>
       </w:r>
     </w:p>
     <w:p>
@@ -961,7 +961,7 @@
           <w:b w:val="0"/>
           <w:sz w:val="22"/>
         </w:rPr>
-        <w:t>目录五段：工程化AI提效必要性；三层架构支撑智能系统；CEA整车故障归因案例；LLM结合确定性符号推理；业务拓展与框架/技术持续优化。</w:t>
+        <w:t>01 工程化AI提效：对企业而言的必要性与需解决的问题。</w:t>
       </w:r>
     </w:p>
     <w:p>
@@ -975,7 +975,49 @@
           <w:b w:val="0"/>
           <w:sz w:val="22"/>
         </w:rPr>
-        <w:t>叙事上先定义企业问题，再给平台架构，再用可量化案例证明，最后把知识骨架与平台迭代上升为可复制方法。</w:t>
+        <w:t>02 三层架构：以架构支撑智能系统，实现工程化AI。</w:t>
+      </w:r>
+    </w:p>
+    <w:p>
+      <w:pPr>
+        <w:pStyle w:val="ListBullet"/>
+        <w:spacing w:after="60"/>
+      </w:pPr>
+      <w:r>
+        <w:rPr>
+          <w:rFonts w:ascii="微软雅黑" w:hAnsi="微软雅黑" w:eastAsia="微软雅黑"/>
+          <w:b w:val="0"/>
+          <w:sz w:val="22"/>
+        </w:rPr>
+        <w:t>03 案例故障归因：以CEA整车故障归因为例介绍知识、流程和智能系统。</w:t>
+      </w:r>
+    </w:p>
+    <w:p>
+      <w:pPr>
+        <w:pStyle w:val="ListBullet"/>
+        <w:spacing w:after="60"/>
+      </w:pPr>
+      <w:r>
+        <w:rPr>
+          <w:rFonts w:ascii="微软雅黑" w:hAnsi="微软雅黑" w:eastAsia="微软雅黑"/>
+          <w:b w:val="0"/>
+          <w:sz w:val="22"/>
+        </w:rPr>
+        <w:t>04 关键技术：LLM结合确定性符号推理能力。</w:t>
+      </w:r>
+    </w:p>
+    <w:p>
+      <w:pPr>
+        <w:pStyle w:val="ListBullet"/>
+        <w:spacing w:after="60"/>
+      </w:pPr>
+      <w:r>
+        <w:rPr>
+          <w:rFonts w:ascii="微软雅黑" w:hAnsi="微软雅黑" w:eastAsia="微软雅黑"/>
+          <w:b w:val="0"/>
+          <w:sz w:val="22"/>
+        </w:rPr>
+        <w:t>05 拓展和优化：业务领域拓展、框架完善与关键技术优化。</w:t>
       </w:r>
     </w:p>
     <w:p>
@@ -1054,7 +1096,7 @@
           <w:b w:val="0"/>
           <w:sz w:val="22"/>
         </w:rPr>
-        <w:t>对外客户叙事与对内平台路线图应同源：先讲企业约束，再讲分层产品，再用单一高ROI场景闭环验证，避免「能力清单」式PPT。</w:t>
+        <w:t>对外叙事可复用「问题—架构—标杆案例—关键技术—演进路线」五段式，便于客户决策层与工程层同时听懂。</w:t>
       </w:r>
     </w:p>
     <w:p>

</xml_diff>